<commit_message>
Update Word guide for Windows and macOS
</commit_message>
<xml_diff>
--- a/docs/Huong_Dan_One_Click_VNPAY_Windows_Mac.docx
+++ b/docs/Huong_Dan_One_Click_VNPAY_Windows_Mac.docx
@@ -4109,7 +4109,25 @@
                 <w:color w:val="123153"/>
                 <w:sz w:val="17"/>
               </w:rPr>
-              <w:t xml:space="preserve"> / Nhập </w:t>
+              <w:t xml:space="preserve"> / </w:t>
+            </w:r>
+            <w:proofErr w:type="spellStart"/>
+            <w:r>
+              <w:rPr>
+                <w:b/>
+                <w:color w:val="123153"/>
+                <w:sz w:val="17"/>
+              </w:rPr>
+              <w:t>Nhập</w:t>
+            </w:r>
+            <w:proofErr w:type="spellEnd"/>
+            <w:r>
+              <w:rPr>
+                <w:b/>
+                <w:color w:val="123153"/>
+                <w:sz w:val="17"/>
+              </w:rPr>
+              <w:t xml:space="preserve"> </w:t>
             </w:r>
             <w:proofErr w:type="spellStart"/>
             <w:r>
@@ -4294,11 +4312,19 @@
             <w:pPr>
               <w:spacing w:after="0"/>
             </w:pPr>
-            <w:r>
-              <w:rPr>
-                <w:sz w:val="17"/>
-              </w:rPr>
-              <w:t xml:space="preserve">Nhập </w:t>
+            <w:proofErr w:type="spellStart"/>
+            <w:r>
+              <w:rPr>
+                <w:sz w:val="17"/>
+              </w:rPr>
+              <w:t>Nhập</w:t>
+            </w:r>
+            <w:proofErr w:type="spellEnd"/>
+            <w:r>
+              <w:rPr>
+                <w:sz w:val="17"/>
+              </w:rPr>
+              <w:t xml:space="preserve"> </w:t>
             </w:r>
             <w:proofErr w:type="spellStart"/>
             <w:r>
@@ -5361,13 +5387,8 @@
             <w:pPr>
               <w:spacing w:after="40"/>
             </w:pPr>
-            <w:proofErr w:type="spellStart"/>
-            <w:r>
-              <w:t>Chạy</w:t>
-            </w:r>
-            <w:proofErr w:type="spellEnd"/>
-            <w:r>
-              <w:t xml:space="preserve"> </w:t>
+            <w:r>
+              <w:t xml:space="preserve">Chạy </w:t>
             </w:r>
             <w:proofErr w:type="spellStart"/>
             <w:r>
@@ -5995,16 +6016,12 @@
           <w:lang w:val="vi-VN"/>
         </w:rPr>
       </w:pPr>
-      <w:r>
-        <w:br w:type="page"/>
-      </w:r>
     </w:p>
     <w:p>
       <w:pPr>
         <w:pStyle w:val="Heading1"/>
       </w:pPr>
       <w:r>
-        <w:lastRenderedPageBreak/>
         <w:t xml:space="preserve">PHẦN </w:t>
       </w:r>
       <w:proofErr w:type="gramStart"/>
@@ -6013,15 +6030,7 @@
       </w:r>
       <w:proofErr w:type="gramEnd"/>
       <w:r>
-        <w:t xml:space="preserve">  </w:t>
-      </w:r>
-      <w:proofErr w:type="spellStart"/>
-      <w:r>
-        <w:t>Chạy</w:t>
-      </w:r>
-      <w:proofErr w:type="spellEnd"/>
-      <w:r>
-        <w:t xml:space="preserve"> One-Click </w:t>
+        <w:t xml:space="preserve">  Chạy One-Click </w:t>
       </w:r>
       <w:proofErr w:type="spellStart"/>
       <w:r>
@@ -6125,15 +6134,7 @@
                 <w:color w:val="123153"/>
                 <w:sz w:val="20"/>
               </w:rPr>
-              <w:t>N</w:t>
-            </w:r>
-            <w:r>
-              <w:rPr>
-                <w:b/>
-                <w:color w:val="123153"/>
-                <w:sz w:val="20"/>
-              </w:rPr>
-              <w:t>hấp</w:t>
+              <w:t>Nhấp</w:t>
             </w:r>
             <w:proofErr w:type="spellEnd"/>
             <w:r>
@@ -6344,6 +6345,7 @@
                 <w:color w:val="123153"/>
                 <w:sz w:val="19"/>
               </w:rPr>
+              <w:lastRenderedPageBreak/>
               <w:t>WINDOWS</w:t>
             </w:r>
           </w:p>
@@ -8082,6 +8084,1434 @@
         </w:rPr>
         <w:t xml:space="preserve">   |   </w:t>
       </w:r>
+    </w:p>
+    <w:p>
+      <w:r>
+        <w:br w:type="page"/>
+      </w:r>
+    </w:p>
+    <w:p>
+      <w:pPr>
+        <w:pStyle w:val="Heading1"/>
+      </w:pPr>
+      <w:r>
+        <w:lastRenderedPageBreak/>
+        <w:t>PHẦN E  ·  Kiểm thử IPN lỗi trên Windows và macOS (không sửa code)</w:t>
+      </w:r>
+    </w:p>
+    <w:p>
+      <w:r>
+        <w:rPr>
+          <w:b/>
+        </w:rPr>
+        <w:t>LƯU Ý: Các thao tác ở Phần E là IPN TỰ MÔ PHỎNG chạy trên máy cá nhân, KHÔNG phải IPN do VNPAY Sandbox gửi. Chỉ dùng với đơn thử nghiệm mới có trạng thái PENDING.</w:t>
+      </w:r>
+    </w:p>
+    <w:p>
+      <w:pPr>
+        <w:pStyle w:val="Heading2"/>
+      </w:pPr>
+      <w:r>
+        <w:t>16  ·  Chuẩn bị máy và tạo đơn PENDING</w:t>
+      </w:r>
+    </w:p>
+    <w:p>
+      <w:r>
+        <w:t>Windows: mở launcher/START_DEMO.bat hoặc launcher/START_PUBLIC_DEMO.bat; giữ server chạy. Mở một cửa sổ PowerShell khác và chuyển vào thư mục GỐC dự án (nơi chứa main.py, config.py, vnpay.py). Cần có file .env hợp lệ và môi trường .venv đã được launcher tạo.</w:t>
+      </w:r>
+    </w:p>
+    <w:p>
+      <w:r>
+        <w:t>Chạy 2 dòng dưới đây trong PowerShell để tạo đơn 50.000 VNĐ. Không cần thanh toán qua cổng VNPAY:</w:t>
+      </w:r>
+    </w:p>
+    <w:p>
+      <w:pPr>
+        <w:spacing w:after="0"/>
+        <w:ind w:left="288"/>
+      </w:pPr>
+      <w:r>
+        <w:rPr>
+          <w:rFonts w:ascii="Consolas" w:hAnsi="Consolas"/>
+          <w:sz w:val="16"/>
+        </w:rPr>
+        <w:t>$created = Invoke-RestMethod -Method Post -Uri 'http://127.0.0.1:8000/api/payment/create-url' -ContentType 'application/json' -Body '{"bank_code":"NCB"}'</w:t>
+      </w:r>
+    </w:p>
+    <w:p>
+      <w:pPr>
+        <w:spacing w:after="0"/>
+        <w:ind w:left="288"/>
+      </w:pPr>
+      <w:r>
+        <w:rPr>
+          <w:rFonts w:ascii="Consolas" w:hAnsi="Consolas"/>
+          <w:sz w:val="16"/>
+        </w:rPr>
+        <w:t>$orderId = $created.order_id; $orderId</w:t>
+      </w:r>
+    </w:p>
+    <w:p>
+      <w:pPr>
+        <w:spacing w:after="0"/>
+      </w:pPr>
+    </w:p>
+    <w:p>
+      <w:r>
+        <w:t>Kết quả: PowerShell in ra mã HD... mới. Đơn vừa tạo có trạng thái PENDING. Tùy chọn kiểm tra bằng lệnh:</w:t>
+      </w:r>
+    </w:p>
+    <w:p>
+      <w:pPr>
+        <w:spacing w:after="0"/>
+        <w:ind w:left="288"/>
+      </w:pPr>
+      <w:r>
+        <w:rPr>
+          <w:rFonts w:ascii="Consolas" w:hAnsi="Consolas"/>
+          <w:sz w:val="16"/>
+        </w:rPr>
+        <w:t>Invoke-RestMethod "http://127.0.0.1:8000/api/orders/$orderId"</w:t>
+      </w:r>
+    </w:p>
+    <w:p>
+      <w:pPr>
+        <w:spacing w:after="0"/>
+      </w:pPr>
+    </w:p>
+    <w:p>
+      <w:pPr>
+        <w:pStyle w:val="Heading2"/>
+      </w:pPr>
+      <w:r>
+        <w:t>17  ·  Khai báo đoạn mã thử IPN ngay trong PowerShell</w:t>
+      </w:r>
+    </w:p>
+    <w:p>
+      <w:r>
+        <w:t>Sao chép nguyên khối lệnh sau vào PowerShell (chỉ thực hiện MỘT lần). Đây là mã chạy trực tiếp trong cửa sổ PowerShell, KHÔNG ghi hoặc sửa bất kỳ file .py nào:</w:t>
+      </w:r>
+    </w:p>
+    <w:p>
+      <w:pPr>
+        <w:spacing w:after="0"/>
+        <w:ind w:left="288"/>
+      </w:pPr>
+      <w:r>
+        <w:rPr>
+          <w:rFonts w:ascii="Consolas" w:hAnsi="Consolas"/>
+          <w:sz w:val="16"/>
+        </w:rPr>
+        <w:t>$ipnTest = @'</w:t>
+      </w:r>
+    </w:p>
+    <w:p>
+      <w:pPr>
+        <w:spacing w:after="0"/>
+        <w:ind w:left="288"/>
+      </w:pPr>
+      <w:r>
+        <w:rPr>
+          <w:rFonts w:ascii="Consolas" w:hAnsi="Consolas"/>
+          <w:sz w:val="16"/>
+        </w:rPr>
+        <w:t>import sys</w:t>
+      </w:r>
+    </w:p>
+    <w:p>
+      <w:pPr>
+        <w:spacing w:after="0"/>
+        <w:ind w:left="288"/>
+      </w:pPr>
+      <w:r>
+        <w:rPr>
+          <w:rFonts w:ascii="Consolas" w:hAnsi="Consolas"/>
+          <w:sz w:val="16"/>
+        </w:rPr>
+        <w:t>import json</w:t>
+      </w:r>
+    </w:p>
+    <w:p>
+      <w:pPr>
+        <w:spacing w:after="0"/>
+        <w:ind w:left="288"/>
+      </w:pPr>
+      <w:r>
+        <w:rPr>
+          <w:rFonts w:ascii="Consolas" w:hAnsi="Consolas"/>
+          <w:sz w:val="16"/>
+        </w:rPr>
+        <w:t>from urllib.parse import urlencode</w:t>
+      </w:r>
+    </w:p>
+    <w:p>
+      <w:pPr>
+        <w:spacing w:after="0"/>
+        <w:ind w:left="288"/>
+      </w:pPr>
+      <w:r>
+        <w:rPr>
+          <w:rFonts w:ascii="Consolas" w:hAnsi="Consolas"/>
+          <w:sz w:val="16"/>
+        </w:rPr>
+        <w:t>from urllib.request import urlopen</w:t>
+      </w:r>
+    </w:p>
+    <w:p>
+      <w:pPr>
+        <w:spacing w:after="0"/>
+        <w:ind w:left="288"/>
+      </w:pPr>
+      <w:r>
+        <w:rPr>
+          <w:rFonts w:ascii="Consolas" w:hAnsi="Consolas"/>
+          <w:sz w:val="16"/>
+        </w:rPr>
+        <w:t>import config</w:t>
+      </w:r>
+    </w:p>
+    <w:p>
+      <w:pPr>
+        <w:spacing w:after="0"/>
+        <w:ind w:left="288"/>
+      </w:pPr>
+      <w:r>
+        <w:rPr>
+          <w:rFonts w:ascii="Consolas" w:hAnsi="Consolas"/>
+          <w:sz w:val="16"/>
+        </w:rPr>
+        <w:t>from vnpay import VNPay</w:t>
+      </w:r>
+    </w:p>
+    <w:p>
+      <w:pPr>
+        <w:spacing w:after="0"/>
+        <w:ind w:left="288"/>
+      </w:pPr>
+    </w:p>
+    <w:p>
+      <w:pPr>
+        <w:spacing w:after="0"/>
+        <w:ind w:left="288"/>
+      </w:pPr>
+      <w:r>
+        <w:rPr>
+          <w:rFonts w:ascii="Consolas" w:hAnsi="Consolas"/>
+          <w:sz w:val="16"/>
+        </w:rPr>
+        <w:t>order_id = sys.argv[1]</w:t>
+      </w:r>
+    </w:p>
+    <w:p>
+      <w:pPr>
+        <w:spacing w:after="0"/>
+        <w:ind w:left="288"/>
+      </w:pPr>
+      <w:r>
+        <w:rPr>
+          <w:rFonts w:ascii="Consolas" w:hAnsi="Consolas"/>
+          <w:sz w:val="16"/>
+        </w:rPr>
+        <w:t>case = sys.argv[2]</w:t>
+      </w:r>
+    </w:p>
+    <w:p>
+      <w:pPr>
+        <w:spacing w:after="0"/>
+        <w:ind w:left="288"/>
+      </w:pPr>
+      <w:r>
+        <w:rPr>
+          <w:rFonts w:ascii="Consolas" w:hAnsi="Consolas"/>
+          <w:sz w:val="16"/>
+        </w:rPr>
+        <w:t>client = VNPay(config.VNPAY_TMN_CODE, config.VNPAY_HASH_SECRET,</w:t>
+      </w:r>
+    </w:p>
+    <w:p>
+      <w:pPr>
+        <w:spacing w:after="0"/>
+        <w:ind w:left="288"/>
+      </w:pPr>
+      <w:r>
+        <w:rPr>
+          <w:rFonts w:ascii="Consolas" w:hAnsi="Consolas"/>
+          <w:sz w:val="16"/>
+        </w:rPr>
+        <w:t xml:space="preserve">               config.VNPAY_PAYMENT_URL, config.VNPAY_RETURN_URL)</w:t>
+      </w:r>
+    </w:p>
+    <w:p>
+      <w:pPr>
+        <w:spacing w:after="0"/>
+        <w:ind w:left="288"/>
+      </w:pPr>
+      <w:r>
+        <w:rPr>
+          <w:rFonts w:ascii="Consolas" w:hAnsi="Consolas"/>
+          <w:sz w:val="16"/>
+        </w:rPr>
+        <w:t>params = {</w:t>
+      </w:r>
+    </w:p>
+    <w:p>
+      <w:pPr>
+        <w:spacing w:after="0"/>
+        <w:ind w:left="288"/>
+      </w:pPr>
+      <w:r>
+        <w:rPr>
+          <w:rFonts w:ascii="Consolas" w:hAnsi="Consolas"/>
+          <w:sz w:val="16"/>
+        </w:rPr>
+        <w:t xml:space="preserve">    'vnp_TmnCode': config.VNPAY_TMN_CODE,</w:t>
+      </w:r>
+    </w:p>
+    <w:p>
+      <w:pPr>
+        <w:spacing w:after="0"/>
+        <w:ind w:left="288"/>
+      </w:pPr>
+      <w:r>
+        <w:rPr>
+          <w:rFonts w:ascii="Consolas" w:hAnsi="Consolas"/>
+          <w:sz w:val="16"/>
+        </w:rPr>
+        <w:t xml:space="preserve">    'vnp_TxnRef': order_id,</w:t>
+      </w:r>
+    </w:p>
+    <w:p>
+      <w:pPr>
+        <w:spacing w:after="0"/>
+        <w:ind w:left="288"/>
+      </w:pPr>
+      <w:r>
+        <w:rPr>
+          <w:rFonts w:ascii="Consolas" w:hAnsi="Consolas"/>
+          <w:sz w:val="16"/>
+        </w:rPr>
+        <w:t xml:space="preserve">    'vnp_Amount': '6000000' if case == 'wrong-amount' else '5000000',</w:t>
+      </w:r>
+    </w:p>
+    <w:p>
+      <w:pPr>
+        <w:spacing w:after="0"/>
+        <w:ind w:left="288"/>
+      </w:pPr>
+      <w:r>
+        <w:rPr>
+          <w:rFonts w:ascii="Consolas" w:hAnsi="Consolas"/>
+          <w:sz w:val="16"/>
+        </w:rPr>
+        <w:t xml:space="preserve">    'vnp_ResponseCode': '00',</w:t>
+      </w:r>
+    </w:p>
+    <w:p>
+      <w:pPr>
+        <w:spacing w:after="0"/>
+        <w:ind w:left="288"/>
+      </w:pPr>
+      <w:r>
+        <w:rPr>
+          <w:rFonts w:ascii="Consolas" w:hAnsi="Consolas"/>
+          <w:sz w:val="16"/>
+        </w:rPr>
+        <w:t xml:space="preserve">    'vnp_TransactionStatus': '00',</w:t>
+      </w:r>
+    </w:p>
+    <w:p>
+      <w:pPr>
+        <w:spacing w:after="0"/>
+        <w:ind w:left="288"/>
+      </w:pPr>
+      <w:r>
+        <w:rPr>
+          <w:rFonts w:ascii="Consolas" w:hAnsi="Consolas"/>
+          <w:sz w:val="16"/>
+        </w:rPr>
+        <w:t xml:space="preserve">    'vnp_TransactionNo': '999999999',</w:t>
+      </w:r>
+    </w:p>
+    <w:p>
+      <w:pPr>
+        <w:spacing w:after="0"/>
+        <w:ind w:left="288"/>
+      </w:pPr>
+      <w:r>
+        <w:rPr>
+          <w:rFonts w:ascii="Consolas" w:hAnsi="Consolas"/>
+          <w:sz w:val="16"/>
+        </w:rPr>
+        <w:t xml:space="preserve">    'vnp_BankCode': 'NCB',</w:t>
+      </w:r>
+    </w:p>
+    <w:p>
+      <w:pPr>
+        <w:spacing w:after="0"/>
+        <w:ind w:left="288"/>
+      </w:pPr>
+      <w:r>
+        <w:rPr>
+          <w:rFonts w:ascii="Consolas" w:hAnsi="Consolas"/>
+          <w:sz w:val="16"/>
+        </w:rPr>
+        <w:t>}</w:t>
+      </w:r>
+    </w:p>
+    <w:p>
+      <w:pPr>
+        <w:spacing w:after="0"/>
+        <w:ind w:left="288"/>
+      </w:pPr>
+      <w:r>
+        <w:rPr>
+          <w:rFonts w:ascii="Consolas" w:hAnsi="Consolas"/>
+          <w:sz w:val="16"/>
+        </w:rPr>
+        <w:t>params['vnp_SecureHash'] = client.sign_params(params)</w:t>
+      </w:r>
+    </w:p>
+    <w:p>
+      <w:pPr>
+        <w:spacing w:after="0"/>
+        <w:ind w:left="288"/>
+      </w:pPr>
+      <w:r>
+        <w:rPr>
+          <w:rFonts w:ascii="Consolas" w:hAnsi="Consolas"/>
+          <w:sz w:val="16"/>
+        </w:rPr>
+        <w:t>if case == 'wrong-signature':</w:t>
+      </w:r>
+    </w:p>
+    <w:p>
+      <w:pPr>
+        <w:spacing w:after="0"/>
+        <w:ind w:left="288"/>
+      </w:pPr>
+      <w:r>
+        <w:rPr>
+          <w:rFonts w:ascii="Consolas" w:hAnsi="Consolas"/>
+          <w:sz w:val="16"/>
+        </w:rPr>
+        <w:t xml:space="preserve">    params['vnp_SecureHash'] = '0' * 128</w:t>
+      </w:r>
+    </w:p>
+    <w:p>
+      <w:pPr>
+        <w:spacing w:after="0"/>
+        <w:ind w:left="288"/>
+      </w:pPr>
+      <w:r>
+        <w:rPr>
+          <w:rFonts w:ascii="Consolas" w:hAnsi="Consolas"/>
+          <w:sz w:val="16"/>
+        </w:rPr>
+        <w:t>url = 'http://127.0.0.1:8000/api/payment/ipn?' + urlencode(params)</w:t>
+      </w:r>
+    </w:p>
+    <w:p>
+      <w:pPr>
+        <w:spacing w:after="0"/>
+        <w:ind w:left="288"/>
+      </w:pPr>
+      <w:r>
+        <w:rPr>
+          <w:rFonts w:ascii="Consolas" w:hAnsi="Consolas"/>
+          <w:sz w:val="16"/>
+        </w:rPr>
+        <w:t>with urlopen(url, timeout=5) as response:</w:t>
+      </w:r>
+    </w:p>
+    <w:p>
+      <w:pPr>
+        <w:spacing w:after="0"/>
+        <w:ind w:left="288"/>
+      </w:pPr>
+      <w:r>
+        <w:rPr>
+          <w:rFonts w:ascii="Consolas" w:hAnsi="Consolas"/>
+          <w:sz w:val="16"/>
+        </w:rPr>
+        <w:t xml:space="preserve">    print('IPN:', json.loads(response.read().decode('utf-8')))</w:t>
+      </w:r>
+    </w:p>
+    <w:p>
+      <w:pPr>
+        <w:spacing w:after="0"/>
+        <w:ind w:left="288"/>
+      </w:pPr>
+      <w:r>
+        <w:rPr>
+          <w:rFonts w:ascii="Consolas" w:hAnsi="Consolas"/>
+          <w:sz w:val="16"/>
+        </w:rPr>
+        <w:t>with urlopen('http://127.0.0.1:8000/api/orders/' + order_id, timeout=5) as response:</w:t>
+      </w:r>
+    </w:p>
+    <w:p>
+      <w:pPr>
+        <w:spacing w:after="0"/>
+        <w:ind w:left="288"/>
+      </w:pPr>
+      <w:r>
+        <w:rPr>
+          <w:rFonts w:ascii="Consolas" w:hAnsi="Consolas"/>
+          <w:sz w:val="16"/>
+        </w:rPr>
+        <w:t xml:space="preserve">    print('Don hang:', json.loads(response.read().decode('utf-8')))</w:t>
+      </w:r>
+    </w:p>
+    <w:p>
+      <w:pPr>
+        <w:spacing w:after="0"/>
+        <w:ind w:left="288"/>
+      </w:pPr>
+      <w:r>
+        <w:rPr>
+          <w:rFonts w:ascii="Consolas" w:hAnsi="Consolas"/>
+          <w:sz w:val="16"/>
+        </w:rPr>
+        <w:t>'@</w:t>
+      </w:r>
+    </w:p>
+    <w:p>
+      <w:pPr>
+        <w:spacing w:after="0"/>
+      </w:pPr>
+    </w:p>
+    <w:p>
+      <w:pPr>
+        <w:pStyle w:val="Heading2"/>
+      </w:pPr>
+      <w:r>
+        <w:t>18  ·  Demo trường hợp IPN sai số tiền</w:t>
+      </w:r>
+    </w:p>
+    <w:p>
+      <w:r>
+        <w:t>Đơn thật là 50.000 VNĐ nên vnp_Amount đúng phải là 5000000 (đơn vị x100). Lệnh này gửi 6000000, tương ứng 60.000 VNĐ, nhưng vẫn ký HMAC đúng trên số tiền sai:</w:t>
+      </w:r>
+    </w:p>
+    <w:p>
+      <w:pPr>
+        <w:spacing w:after="0"/>
+        <w:ind w:left="288"/>
+      </w:pPr>
+      <w:r>
+        <w:rPr>
+          <w:rFonts w:ascii="Consolas" w:hAnsi="Consolas"/>
+          <w:sz w:val="16"/>
+        </w:rPr>
+        <w:t>$ipnTest | &amp; .\.venv\Scripts\python.exe - $orderId wrong-amount</w:t>
+      </w:r>
+    </w:p>
+    <w:p>
+      <w:pPr>
+        <w:spacing w:after="0"/>
+      </w:pPr>
+    </w:p>
+    <w:p>
+      <w:r>
+        <w:rPr>
+          <w:b/>
+        </w:rPr>
+        <w:t>KẾT QUẢ MONG ĐỢI: IPN trả {"RspCode":"04","Message":"Invalid amount"}; khi tra đơn, status vẫn là "PENDING". Đây là yêu cầu sai số tiền bị TỪ CHỐI, không phải đơn hàng đã FAILED.</w:t>
+      </w:r>
+    </w:p>
+    <w:p>
+      <w:pPr>
+        <w:pStyle w:val="Heading2"/>
+      </w:pPr>
+      <w:r>
+        <w:t>19  ·  Demo trường hợp IPN sai chữ ký HMAC</w:t>
+      </w:r>
+    </w:p>
+    <w:p>
+      <w:r>
+        <w:t>Lệnh này dùng số tiền đúng 5000000 nhưng cố tình thay vnp_SecureHash thành 128 ký tự 0:</w:t>
+      </w:r>
+    </w:p>
+    <w:p>
+      <w:pPr>
+        <w:spacing w:after="0"/>
+        <w:ind w:left="288"/>
+      </w:pPr>
+      <w:r>
+        <w:rPr>
+          <w:rFonts w:ascii="Consolas" w:hAnsi="Consolas"/>
+          <w:sz w:val="16"/>
+        </w:rPr>
+        <w:t>$ipnTest | &amp; .\.venv\Scripts\python.exe - $orderId wrong-signature</w:t>
+      </w:r>
+    </w:p>
+    <w:p>
+      <w:pPr>
+        <w:spacing w:after="0"/>
+      </w:pPr>
+    </w:p>
+    <w:p>
+      <w:r>
+        <w:rPr>
+          <w:b/>
+        </w:rPr>
+        <w:t>KẾT QUẢ MONG ĐỢI: IPN trả {"RspCode":"97","Message":"Invalid signature"}; trạng thái đơn vẫn "PENDING". Backend kiểm tra chữ ký trước khi xử lý số tiền.</w:t>
+      </w:r>
+    </w:p>
+    <w:p>
+      <w:r>
+        <w:br w:type="page"/>
+      </w:r>
+    </w:p>
+    <w:p>
+      <w:pPr>
+        <w:pStyle w:val="Heading1"/>
+        <w:spacing w:before="220" w:after="120"/>
+      </w:pPr>
+      <w:r>
+        <w:lastRenderedPageBreak/>
+        <w:t>PHẦN E (TIẾP)  ·  macOS Terminal: IPN sai số tiền và sai chữ ký</w:t>
+      </w:r>
+    </w:p>
+    <w:p>
+      <w:pPr>
+        <w:spacing w:after="100"/>
+      </w:pPr>
+      <w:r>
+        <w:t>Các bước 20–23 dưới đây tương đương với bước 16–19 trên Windows. Chạy trực tiếp trên Mac, KHÔNG tạo/sửa file Python, KHÔNG cần Postman hoặc ngrok vì các yêu cầu thử được gửi vào localhost.</w:t>
+      </w:r>
+    </w:p>
+    <w:p>
+      <w:pPr>
+        <w:pStyle w:val="Heading2"/>
+        <w:spacing w:before="220" w:after="120"/>
+      </w:pPr>
+      <w:r>
+        <w:t>20  ·  Khởi động VNStore và tạo một đơn PENDING</w:t>
+      </w:r>
+    </w:p>
+    <w:p>
+      <w:pPr>
+        <w:spacing w:after="100"/>
+      </w:pPr>
+      <w:r>
+        <w:t>Trên Mac, nhấp đúp launcher/START_DEMO.command hoặc launcher/START_PUBLIC_DEMO.command; giữ FastAPI chạy. Mở Terminal mới, chuyển vào thư mục GỐC chứa main.py và .venv. Cần có .env hợp lệ.</w:t>
+      </w:r>
+    </w:p>
+    <w:p>
+      <w:pPr>
+        <w:spacing w:after="100"/>
+      </w:pPr>
+      <w:r>
+        <w:t>Tạo đơn mới 50.000 VNĐ và lưu mã đơn vào biến orderId (sao chép nguyên khối):</w:t>
+      </w:r>
+    </w:p>
+    <w:p>
+      <w:pPr>
+        <w:shd w:val="clear" w:color="auto" w:fill="F2F6FA"/>
+        <w:spacing w:after="0" w:line="240" w:lineRule="auto"/>
+        <w:ind w:left="245" w:right="115"/>
+      </w:pPr>
+      <w:r>
+        <w:rPr>
+          <w:rFonts w:ascii="Consolas" w:hAnsi="Consolas"/>
+          <w:color w:val="223D59"/>
+          <w:sz w:val="15"/>
+        </w:rPr>
+        <w:t>orderId=$(curl -fsS -X POST "http://127.0.0.1:8000/api/payment/create-url" \</w:t>
+      </w:r>
+    </w:p>
+    <w:p>
+      <w:pPr>
+        <w:shd w:val="clear" w:color="auto" w:fill="F2F6FA"/>
+        <w:spacing w:after="0" w:line="240" w:lineRule="auto"/>
+        <w:ind w:left="245" w:right="115"/>
+      </w:pPr>
+      <w:r>
+        <w:rPr>
+          <w:rFonts w:ascii="Consolas" w:hAnsi="Consolas"/>
+          <w:color w:val="223D59"/>
+          <w:sz w:val="15"/>
+        </w:rPr>
+        <w:t xml:space="preserve">  -H "Content-Type: application/json" \</w:t>
+      </w:r>
+    </w:p>
+    <w:p>
+      <w:pPr>
+        <w:shd w:val="clear" w:color="auto" w:fill="F2F6FA"/>
+        <w:spacing w:after="0" w:line="240" w:lineRule="auto"/>
+        <w:ind w:left="245" w:right="115"/>
+      </w:pPr>
+      <w:r>
+        <w:rPr>
+          <w:rFonts w:ascii="Consolas" w:hAnsi="Consolas"/>
+          <w:color w:val="223D59"/>
+          <w:sz w:val="15"/>
+        </w:rPr>
+        <w:t xml:space="preserve">  -d '{"bank_code":"NCB"}' \</w:t>
+      </w:r>
+    </w:p>
+    <w:p>
+      <w:pPr>
+        <w:shd w:val="clear" w:color="auto" w:fill="F2F6FA"/>
+        <w:spacing w:after="0" w:line="240" w:lineRule="auto"/>
+        <w:ind w:left="245" w:right="115"/>
+      </w:pPr>
+      <w:r>
+        <w:rPr>
+          <w:rFonts w:ascii="Consolas" w:hAnsi="Consolas"/>
+          <w:color w:val="223D59"/>
+          <w:sz w:val="15"/>
+        </w:rPr>
+        <w:t xml:space="preserve">  | ./.venv/bin/python -c 'import sys,json; print(json.load(sys.stdin)["order_id"])')</w:t>
+      </w:r>
+    </w:p>
+    <w:p>
+      <w:pPr>
+        <w:shd w:val="clear" w:color="auto" w:fill="F2F6FA"/>
+        <w:spacing w:after="0" w:line="240" w:lineRule="auto"/>
+        <w:ind w:left="245" w:right="115"/>
+      </w:pPr>
+      <w:r>
+        <w:rPr>
+          <w:rFonts w:ascii="Consolas" w:hAnsi="Consolas"/>
+          <w:color w:val="223D59"/>
+          <w:sz w:val="15"/>
+        </w:rPr>
+        <w:t>echo "$orderId"</w:t>
+      </w:r>
+    </w:p>
+    <w:p>
+      <w:pPr>
+        <w:spacing w:after="40"/>
+      </w:pPr>
+    </w:p>
+    <w:p>
+      <w:pPr>
+        <w:spacing w:after="100"/>
+      </w:pPr>
+      <w:r>
+        <w:t>Kiểm tra trạng thái đơn vừa tạo:</w:t>
+      </w:r>
+    </w:p>
+    <w:p>
+      <w:pPr>
+        <w:shd w:val="clear" w:color="auto" w:fill="F2F6FA"/>
+        <w:spacing w:after="0" w:line="240" w:lineRule="auto"/>
+        <w:ind w:left="245" w:right="115"/>
+      </w:pPr>
+      <w:r>
+        <w:rPr>
+          <w:rFonts w:ascii="Consolas" w:hAnsi="Consolas"/>
+          <w:color w:val="223D59"/>
+          <w:sz w:val="15"/>
+        </w:rPr>
+        <w:t>curl -s "http://127.0.0.1:8000/api/orders/$orderId"</w:t>
+      </w:r>
+    </w:p>
+    <w:p>
+      <w:pPr>
+        <w:spacing w:after="40"/>
+      </w:pPr>
+    </w:p>
+    <w:p>
+      <w:pPr>
+        <w:spacing w:after="100"/>
+      </w:pPr>
+      <w:r>
+        <w:t>Kết quả: Terminal hiển thị mã đơn hàng mới và status là PENDING. Nếu lệnh không trả mã đơn, hãy kiểm tra FastAPI đang chạy tại cổng 8000 và .env đã thiết lập đúng.</w:t>
+      </w:r>
+    </w:p>
+    <w:p>
+      <w:pPr>
+        <w:pStyle w:val="Heading2"/>
+        <w:spacing w:before="220" w:after="120"/>
+      </w:pPr>
+      <w:r>
+        <w:t>21  ·  Khai báo hàm mô phỏng IPN trong Terminal</w:t>
+      </w:r>
+    </w:p>
+    <w:p>
+      <w:pPr>
+        <w:spacing w:after="100"/>
+      </w:pPr>
+      <w:r>
+        <w:t>Sao chép NGUYÊN KHỐI dưới đây vào Terminal một lần. Đây là hàm tạm của phiên Terminal; đóng Terminal thì cần khai báo lại. Dòng PY phải đứng riêng và không có dấu cách ở đầu.</w:t>
+      </w:r>
+    </w:p>
+    <w:p>
+      <w:pPr>
+        <w:shd w:val="clear" w:color="auto" w:fill="F2F6FA"/>
+        <w:spacing w:after="0" w:line="240" w:lineRule="auto"/>
+        <w:ind w:left="245" w:right="115"/>
+      </w:pPr>
+      <w:r>
+        <w:rPr>
+          <w:rFonts w:ascii="Consolas" w:hAnsi="Consolas"/>
+          <w:color w:val="223D59"/>
+          <w:sz w:val="15"/>
+        </w:rPr>
+        <w:t>ipn_test() {</w:t>
+      </w:r>
+    </w:p>
+    <w:p>
+      <w:pPr>
+        <w:shd w:val="clear" w:color="auto" w:fill="F2F6FA"/>
+        <w:spacing w:after="0" w:line="240" w:lineRule="auto"/>
+        <w:ind w:left="245" w:right="115"/>
+      </w:pPr>
+      <w:r>
+        <w:rPr>
+          <w:rFonts w:ascii="Consolas" w:hAnsi="Consolas"/>
+          <w:color w:val="223D59"/>
+          <w:sz w:val="15"/>
+        </w:rPr>
+        <w:t xml:space="preserve">  ./.venv/bin/python - "$1" "$2" &lt;&lt;'PY'</w:t>
+      </w:r>
+    </w:p>
+    <w:p>
+      <w:pPr>
+        <w:shd w:val="clear" w:color="auto" w:fill="F2F6FA"/>
+        <w:spacing w:after="0" w:line="240" w:lineRule="auto"/>
+        <w:ind w:left="245" w:right="115"/>
+      </w:pPr>
+      <w:r>
+        <w:rPr>
+          <w:rFonts w:ascii="Consolas" w:hAnsi="Consolas"/>
+          <w:color w:val="223D59"/>
+          <w:sz w:val="15"/>
+        </w:rPr>
+        <w:t>import sys</w:t>
+      </w:r>
+    </w:p>
+    <w:p>
+      <w:pPr>
+        <w:shd w:val="clear" w:color="auto" w:fill="F2F6FA"/>
+        <w:spacing w:after="0" w:line="240" w:lineRule="auto"/>
+        <w:ind w:left="245" w:right="115"/>
+      </w:pPr>
+      <w:r>
+        <w:rPr>
+          <w:rFonts w:ascii="Consolas" w:hAnsi="Consolas"/>
+          <w:color w:val="223D59"/>
+          <w:sz w:val="15"/>
+        </w:rPr>
+        <w:t>import json</w:t>
+      </w:r>
+    </w:p>
+    <w:p>
+      <w:pPr>
+        <w:shd w:val="clear" w:color="auto" w:fill="F2F6FA"/>
+        <w:spacing w:after="0" w:line="240" w:lineRule="auto"/>
+        <w:ind w:left="245" w:right="115"/>
+      </w:pPr>
+      <w:r>
+        <w:rPr>
+          <w:rFonts w:ascii="Consolas" w:hAnsi="Consolas"/>
+          <w:color w:val="223D59"/>
+          <w:sz w:val="15"/>
+        </w:rPr>
+        <w:t>from urllib.parse import urlencode</w:t>
+      </w:r>
+    </w:p>
+    <w:p>
+      <w:pPr>
+        <w:shd w:val="clear" w:color="auto" w:fill="F2F6FA"/>
+        <w:spacing w:after="0" w:line="240" w:lineRule="auto"/>
+        <w:ind w:left="245" w:right="115"/>
+      </w:pPr>
+      <w:r>
+        <w:rPr>
+          <w:rFonts w:ascii="Consolas" w:hAnsi="Consolas"/>
+          <w:color w:val="223D59"/>
+          <w:sz w:val="15"/>
+        </w:rPr>
+        <w:t>from urllib.request import urlopen</w:t>
+      </w:r>
+    </w:p>
+    <w:p>
+      <w:pPr>
+        <w:shd w:val="clear" w:color="auto" w:fill="F2F6FA"/>
+        <w:spacing w:after="0" w:line="240" w:lineRule="auto"/>
+        <w:ind w:left="245" w:right="115"/>
+      </w:pPr>
+      <w:r>
+        <w:rPr>
+          <w:rFonts w:ascii="Consolas" w:hAnsi="Consolas"/>
+          <w:color w:val="223D59"/>
+          <w:sz w:val="15"/>
+        </w:rPr>
+        <w:t>import config</w:t>
+      </w:r>
+    </w:p>
+    <w:p>
+      <w:pPr>
+        <w:shd w:val="clear" w:color="auto" w:fill="F2F6FA"/>
+        <w:spacing w:after="0" w:line="240" w:lineRule="auto"/>
+        <w:ind w:left="245" w:right="115"/>
+      </w:pPr>
+      <w:r>
+        <w:rPr>
+          <w:rFonts w:ascii="Consolas" w:hAnsi="Consolas"/>
+          <w:color w:val="223D59"/>
+          <w:sz w:val="15"/>
+        </w:rPr>
+        <w:t>from vnpay import VNPay</w:t>
+      </w:r>
+    </w:p>
+    <w:p>
+      <w:pPr>
+        <w:shd w:val="clear" w:color="auto" w:fill="F2F6FA"/>
+        <w:spacing w:after="0" w:line="240" w:lineRule="auto"/>
+        <w:ind w:left="245" w:right="115"/>
+      </w:pPr>
+      <w:r>
+        <w:rPr>
+          <w:rFonts w:ascii="Consolas" w:hAnsi="Consolas"/>
+          <w:color w:val="223D59"/>
+          <w:sz w:val="15"/>
+        </w:rPr>
+        <w:t xml:space="preserve"> </w:t>
+      </w:r>
+    </w:p>
+    <w:p>
+      <w:pPr>
+        <w:shd w:val="clear" w:color="auto" w:fill="F2F6FA"/>
+        <w:spacing w:after="0" w:line="240" w:lineRule="auto"/>
+        <w:ind w:left="245" w:right="115"/>
+      </w:pPr>
+      <w:r>
+        <w:rPr>
+          <w:rFonts w:ascii="Consolas" w:hAnsi="Consolas"/>
+          <w:color w:val="223D59"/>
+          <w:sz w:val="15"/>
+        </w:rPr>
+        <w:t>order_id = sys.argv[1]</w:t>
+      </w:r>
+    </w:p>
+    <w:p>
+      <w:pPr>
+        <w:shd w:val="clear" w:color="auto" w:fill="F2F6FA"/>
+        <w:spacing w:after="0" w:line="240" w:lineRule="auto"/>
+        <w:ind w:left="245" w:right="115"/>
+      </w:pPr>
+      <w:r>
+        <w:rPr>
+          <w:rFonts w:ascii="Consolas" w:hAnsi="Consolas"/>
+          <w:color w:val="223D59"/>
+          <w:sz w:val="15"/>
+        </w:rPr>
+        <w:t>case = sys.argv[2]</w:t>
+      </w:r>
+    </w:p>
+    <w:p>
+      <w:pPr>
+        <w:shd w:val="clear" w:color="auto" w:fill="F2F6FA"/>
+        <w:spacing w:after="0" w:line="240" w:lineRule="auto"/>
+        <w:ind w:left="245" w:right="115"/>
+      </w:pPr>
+      <w:r>
+        <w:rPr>
+          <w:rFonts w:ascii="Consolas" w:hAnsi="Consolas"/>
+          <w:color w:val="223D59"/>
+          <w:sz w:val="15"/>
+        </w:rPr>
+        <w:t>client = VNPay(</w:t>
+      </w:r>
+    </w:p>
+    <w:p>
+      <w:pPr>
+        <w:shd w:val="clear" w:color="auto" w:fill="F2F6FA"/>
+        <w:spacing w:after="0" w:line="240" w:lineRule="auto"/>
+        <w:ind w:left="245" w:right="115"/>
+      </w:pPr>
+      <w:r>
+        <w:rPr>
+          <w:rFonts w:ascii="Consolas" w:hAnsi="Consolas"/>
+          <w:color w:val="223D59"/>
+          <w:sz w:val="15"/>
+        </w:rPr>
+        <w:t xml:space="preserve">    config.VNPAY_TMN_CODE,</w:t>
+      </w:r>
+    </w:p>
+    <w:p>
+      <w:pPr>
+        <w:shd w:val="clear" w:color="auto" w:fill="F2F6FA"/>
+        <w:spacing w:after="0" w:line="240" w:lineRule="auto"/>
+        <w:ind w:left="245" w:right="115"/>
+      </w:pPr>
+      <w:r>
+        <w:rPr>
+          <w:rFonts w:ascii="Consolas" w:hAnsi="Consolas"/>
+          <w:color w:val="223D59"/>
+          <w:sz w:val="15"/>
+        </w:rPr>
+        <w:t xml:space="preserve">    config.VNPAY_HASH_SECRET,</w:t>
+      </w:r>
+    </w:p>
+    <w:p>
+      <w:pPr>
+        <w:shd w:val="clear" w:color="auto" w:fill="F2F6FA"/>
+        <w:spacing w:after="0" w:line="240" w:lineRule="auto"/>
+        <w:ind w:left="245" w:right="115"/>
+      </w:pPr>
+      <w:r>
+        <w:rPr>
+          <w:rFonts w:ascii="Consolas" w:hAnsi="Consolas"/>
+          <w:color w:val="223D59"/>
+          <w:sz w:val="15"/>
+        </w:rPr>
+        <w:t xml:space="preserve">    config.VNPAY_PAYMENT_URL,</w:t>
+      </w:r>
+    </w:p>
+    <w:p>
+      <w:pPr>
+        <w:shd w:val="clear" w:color="auto" w:fill="F2F6FA"/>
+        <w:spacing w:after="0" w:line="240" w:lineRule="auto"/>
+        <w:ind w:left="245" w:right="115"/>
+      </w:pPr>
+      <w:r>
+        <w:rPr>
+          <w:rFonts w:ascii="Consolas" w:hAnsi="Consolas"/>
+          <w:color w:val="223D59"/>
+          <w:sz w:val="15"/>
+        </w:rPr>
+        <w:t xml:space="preserve">    config.VNPAY_RETURN_URL</w:t>
+      </w:r>
+    </w:p>
+    <w:p>
+      <w:pPr>
+        <w:shd w:val="clear" w:color="auto" w:fill="F2F6FA"/>
+        <w:spacing w:after="0" w:line="240" w:lineRule="auto"/>
+        <w:ind w:left="245" w:right="115"/>
+      </w:pPr>
+      <w:r>
+        <w:rPr>
+          <w:rFonts w:ascii="Consolas" w:hAnsi="Consolas"/>
+          <w:color w:val="223D59"/>
+          <w:sz w:val="15"/>
+        </w:rPr>
+        <w:t>)</w:t>
+      </w:r>
+    </w:p>
+    <w:p>
+      <w:pPr>
+        <w:shd w:val="clear" w:color="auto" w:fill="F2F6FA"/>
+        <w:spacing w:after="0" w:line="240" w:lineRule="auto"/>
+        <w:ind w:left="245" w:right="115"/>
+      </w:pPr>
+      <w:r>
+        <w:rPr>
+          <w:rFonts w:ascii="Consolas" w:hAnsi="Consolas"/>
+          <w:color w:val="223D59"/>
+          <w:sz w:val="15"/>
+        </w:rPr>
+        <w:t>params = {</w:t>
+      </w:r>
+    </w:p>
+    <w:p>
+      <w:pPr>
+        <w:shd w:val="clear" w:color="auto" w:fill="F2F6FA"/>
+        <w:spacing w:after="0" w:line="240" w:lineRule="auto"/>
+        <w:ind w:left="245" w:right="115"/>
+      </w:pPr>
+      <w:r>
+        <w:rPr>
+          <w:rFonts w:ascii="Consolas" w:hAnsi="Consolas"/>
+          <w:color w:val="223D59"/>
+          <w:sz w:val="15"/>
+        </w:rPr>
+        <w:t xml:space="preserve">    "vnp_TmnCode": config.VNPAY_TMN_CODE,</w:t>
+      </w:r>
+    </w:p>
+    <w:p>
+      <w:pPr>
+        <w:shd w:val="clear" w:color="auto" w:fill="F2F6FA"/>
+        <w:spacing w:after="0" w:line="240" w:lineRule="auto"/>
+        <w:ind w:left="245" w:right="115"/>
+      </w:pPr>
+      <w:r>
+        <w:rPr>
+          <w:rFonts w:ascii="Consolas" w:hAnsi="Consolas"/>
+          <w:color w:val="223D59"/>
+          <w:sz w:val="15"/>
+        </w:rPr>
+        <w:t xml:space="preserve">    "vnp_TxnRef": order_id,</w:t>
+      </w:r>
+    </w:p>
+    <w:p>
+      <w:pPr>
+        <w:shd w:val="clear" w:color="auto" w:fill="F2F6FA"/>
+        <w:spacing w:after="0" w:line="240" w:lineRule="auto"/>
+        <w:ind w:left="245" w:right="115"/>
+      </w:pPr>
+      <w:r>
+        <w:rPr>
+          <w:rFonts w:ascii="Consolas" w:hAnsi="Consolas"/>
+          <w:color w:val="223D59"/>
+          <w:sz w:val="15"/>
+        </w:rPr>
+        <w:t xml:space="preserve">    "vnp_Amount": "6000000" if case == "wrong-amount" else "5000000",</w:t>
+      </w:r>
+    </w:p>
+    <w:p>
+      <w:pPr>
+        <w:shd w:val="clear" w:color="auto" w:fill="F2F6FA"/>
+        <w:spacing w:after="0" w:line="240" w:lineRule="auto"/>
+        <w:ind w:left="245" w:right="115"/>
+      </w:pPr>
+      <w:r>
+        <w:rPr>
+          <w:rFonts w:ascii="Consolas" w:hAnsi="Consolas"/>
+          <w:color w:val="223D59"/>
+          <w:sz w:val="15"/>
+        </w:rPr>
+        <w:t xml:space="preserve">    "vnp_ResponseCode": "00",</w:t>
+      </w:r>
+    </w:p>
+    <w:p>
+      <w:pPr>
+        <w:shd w:val="clear" w:color="auto" w:fill="F2F6FA"/>
+        <w:spacing w:after="0" w:line="240" w:lineRule="auto"/>
+        <w:ind w:left="245" w:right="115"/>
+      </w:pPr>
+      <w:r>
+        <w:rPr>
+          <w:rFonts w:ascii="Consolas" w:hAnsi="Consolas"/>
+          <w:color w:val="223D59"/>
+          <w:sz w:val="15"/>
+        </w:rPr>
+        <w:t xml:space="preserve">    "vnp_TransactionStatus": "00",</w:t>
+      </w:r>
+    </w:p>
+    <w:p>
+      <w:pPr>
+        <w:shd w:val="clear" w:color="auto" w:fill="F2F6FA"/>
+        <w:spacing w:after="0" w:line="240" w:lineRule="auto"/>
+        <w:ind w:left="245" w:right="115"/>
+      </w:pPr>
+      <w:r>
+        <w:rPr>
+          <w:rFonts w:ascii="Consolas" w:hAnsi="Consolas"/>
+          <w:color w:val="223D59"/>
+          <w:sz w:val="15"/>
+        </w:rPr>
+        <w:t xml:space="preserve">    "vnp_TransactionNo": "999999999",</w:t>
+      </w:r>
+    </w:p>
+    <w:p>
+      <w:pPr>
+        <w:shd w:val="clear" w:color="auto" w:fill="F2F6FA"/>
+        <w:spacing w:after="0" w:line="240" w:lineRule="auto"/>
+        <w:ind w:left="245" w:right="115"/>
+      </w:pPr>
+      <w:r>
+        <w:rPr>
+          <w:rFonts w:ascii="Consolas" w:hAnsi="Consolas"/>
+          <w:color w:val="223D59"/>
+          <w:sz w:val="15"/>
+        </w:rPr>
+        <w:t xml:space="preserve">    "vnp_BankCode": "NCB",</w:t>
+      </w:r>
+    </w:p>
+    <w:p>
+      <w:pPr>
+        <w:shd w:val="clear" w:color="auto" w:fill="F2F6FA"/>
+        <w:spacing w:after="0" w:line="240" w:lineRule="auto"/>
+        <w:ind w:left="245" w:right="115"/>
+      </w:pPr>
+      <w:r>
+        <w:rPr>
+          <w:rFonts w:ascii="Consolas" w:hAnsi="Consolas"/>
+          <w:color w:val="223D59"/>
+          <w:sz w:val="15"/>
+        </w:rPr>
+        <w:t>}</w:t>
+      </w:r>
+    </w:p>
+    <w:p>
+      <w:pPr>
+        <w:shd w:val="clear" w:color="auto" w:fill="F2F6FA"/>
+        <w:spacing w:after="0" w:line="240" w:lineRule="auto"/>
+        <w:ind w:left="245" w:right="115"/>
+      </w:pPr>
+      <w:r>
+        <w:rPr>
+          <w:rFonts w:ascii="Consolas" w:hAnsi="Consolas"/>
+          <w:color w:val="223D59"/>
+          <w:sz w:val="15"/>
+        </w:rPr>
+        <w:t>params["vnp_SecureHash"] = client.sign_params(params)</w:t>
+      </w:r>
+    </w:p>
+    <w:p>
+      <w:pPr>
+        <w:shd w:val="clear" w:color="auto" w:fill="F2F6FA"/>
+        <w:spacing w:after="0" w:line="240" w:lineRule="auto"/>
+        <w:ind w:left="245" w:right="115"/>
+      </w:pPr>
+      <w:r>
+        <w:rPr>
+          <w:rFonts w:ascii="Consolas" w:hAnsi="Consolas"/>
+          <w:color w:val="223D59"/>
+          <w:sz w:val="15"/>
+        </w:rPr>
+        <w:t>if case == "wrong-signature":</w:t>
+      </w:r>
+    </w:p>
+    <w:p>
+      <w:pPr>
+        <w:shd w:val="clear" w:color="auto" w:fill="F2F6FA"/>
+        <w:spacing w:after="0" w:line="240" w:lineRule="auto"/>
+        <w:ind w:left="245" w:right="115"/>
+      </w:pPr>
+      <w:r>
+        <w:rPr>
+          <w:rFonts w:ascii="Consolas" w:hAnsi="Consolas"/>
+          <w:color w:val="223D59"/>
+          <w:sz w:val="15"/>
+        </w:rPr>
+        <w:t xml:space="preserve">    params["vnp_SecureHash"] = "0" * 128</w:t>
+      </w:r>
+    </w:p>
+    <w:p>
+      <w:pPr>
+        <w:shd w:val="clear" w:color="auto" w:fill="F2F6FA"/>
+        <w:spacing w:after="0" w:line="240" w:lineRule="auto"/>
+        <w:ind w:left="245" w:right="115"/>
+      </w:pPr>
+      <w:r>
+        <w:rPr>
+          <w:rFonts w:ascii="Consolas" w:hAnsi="Consolas"/>
+          <w:color w:val="223D59"/>
+          <w:sz w:val="15"/>
+        </w:rPr>
+        <w:t xml:space="preserve"> </w:t>
+      </w:r>
+    </w:p>
+    <w:p>
+      <w:pPr>
+        <w:shd w:val="clear" w:color="auto" w:fill="F2F6FA"/>
+        <w:spacing w:after="0" w:line="240" w:lineRule="auto"/>
+        <w:ind w:left="245" w:right="115"/>
+      </w:pPr>
+      <w:r>
+        <w:rPr>
+          <w:rFonts w:ascii="Consolas" w:hAnsi="Consolas"/>
+          <w:color w:val="223D59"/>
+          <w:sz w:val="15"/>
+        </w:rPr>
+        <w:t>url = "http://127.0.0.1:8000/api/payment/ipn?" + urlencode(params)</w:t>
+      </w:r>
+    </w:p>
+    <w:p>
+      <w:pPr>
+        <w:shd w:val="clear" w:color="auto" w:fill="F2F6FA"/>
+        <w:spacing w:after="0" w:line="240" w:lineRule="auto"/>
+        <w:ind w:left="245" w:right="115"/>
+      </w:pPr>
+      <w:r>
+        <w:rPr>
+          <w:rFonts w:ascii="Consolas" w:hAnsi="Consolas"/>
+          <w:color w:val="223D59"/>
+          <w:sz w:val="15"/>
+        </w:rPr>
+        <w:t>with urlopen(url, timeout=5) as response:</w:t>
+      </w:r>
+    </w:p>
+    <w:p>
+      <w:pPr>
+        <w:shd w:val="clear" w:color="auto" w:fill="F2F6FA"/>
+        <w:spacing w:after="0" w:line="240" w:lineRule="auto"/>
+        <w:ind w:left="245" w:right="115"/>
+      </w:pPr>
+      <w:r>
+        <w:rPr>
+          <w:rFonts w:ascii="Consolas" w:hAnsi="Consolas"/>
+          <w:color w:val="223D59"/>
+          <w:sz w:val="15"/>
+        </w:rPr>
+        <w:t xml:space="preserve">    print("IPN:", json.loads(response.read().decode("utf-8")))</w:t>
+      </w:r>
+    </w:p>
+    <w:p>
+      <w:pPr>
+        <w:shd w:val="clear" w:color="auto" w:fill="F2F6FA"/>
+        <w:spacing w:after="0" w:line="240" w:lineRule="auto"/>
+        <w:ind w:left="245" w:right="115"/>
+      </w:pPr>
+      <w:r>
+        <w:rPr>
+          <w:rFonts w:ascii="Consolas" w:hAnsi="Consolas"/>
+          <w:color w:val="223D59"/>
+          <w:sz w:val="15"/>
+        </w:rPr>
+        <w:t>with urlopen("http://127.0.0.1:8000/api/orders/" + order_id, timeout=5) as response:</w:t>
+      </w:r>
+    </w:p>
+    <w:p>
+      <w:pPr>
+        <w:shd w:val="clear" w:color="auto" w:fill="F2F6FA"/>
+        <w:spacing w:after="0" w:line="240" w:lineRule="auto"/>
+        <w:ind w:left="245" w:right="115"/>
+      </w:pPr>
+      <w:r>
+        <w:rPr>
+          <w:rFonts w:ascii="Consolas" w:hAnsi="Consolas"/>
+          <w:color w:val="223D59"/>
+          <w:sz w:val="15"/>
+        </w:rPr>
+        <w:t xml:space="preserve">    print("Don hang:", json.loads(response.read().decode("utf-8")))</w:t>
+      </w:r>
+    </w:p>
+    <w:p>
+      <w:pPr>
+        <w:shd w:val="clear" w:color="auto" w:fill="F2F6FA"/>
+        <w:spacing w:after="0" w:line="240" w:lineRule="auto"/>
+        <w:ind w:left="245" w:right="115"/>
+      </w:pPr>
+      <w:r>
+        <w:rPr>
+          <w:rFonts w:ascii="Consolas" w:hAnsi="Consolas"/>
+          <w:color w:val="223D59"/>
+          <w:sz w:val="15"/>
+        </w:rPr>
+        <w:t>PY</w:t>
+      </w:r>
+    </w:p>
+    <w:p>
+      <w:pPr>
+        <w:shd w:val="clear" w:color="auto" w:fill="F2F6FA"/>
+        <w:spacing w:after="0" w:line="240" w:lineRule="auto"/>
+        <w:ind w:left="245" w:right="115"/>
+      </w:pPr>
+      <w:r>
+        <w:rPr>
+          <w:rFonts w:ascii="Consolas" w:hAnsi="Consolas"/>
+          <w:color w:val="223D59"/>
+          <w:sz w:val="15"/>
+        </w:rPr>
+        <w:t>}</w:t>
+      </w:r>
+    </w:p>
+    <w:p>
+      <w:pPr>
+        <w:spacing w:after="40"/>
+      </w:pPr>
+    </w:p>
+    <w:p>
+      <w:pPr>
+        <w:pStyle w:val="Heading2"/>
+        <w:spacing w:before="220" w:after="120"/>
+      </w:pPr>
+      <w:r>
+        <w:t>22  ·  Demo IPN sai số tiền trên macOS</w:t>
+      </w:r>
+    </w:p>
+    <w:p>
+      <w:pPr>
+        <w:spacing w:after="100"/>
+      </w:pPr>
+      <w:r>
+        <w:t>Đơn trong SQLite là 50.000 VNĐ, nhưng IPN mô phỏng ghi 60.000 VNĐ (vnp_Amount=6000000). Đoạn mã vẫn ký HMAC đúng trên dữ liệu sai số tiền.</w:t>
+      </w:r>
+    </w:p>
+    <w:p>
+      <w:pPr>
+        <w:shd w:val="clear" w:color="auto" w:fill="F2F6FA"/>
+        <w:spacing w:after="0" w:line="240" w:lineRule="auto"/>
+        <w:ind w:left="245" w:right="115"/>
+      </w:pPr>
+      <w:r>
+        <w:rPr>
+          <w:rFonts w:ascii="Consolas" w:hAnsi="Consolas"/>
+          <w:color w:val="223D59"/>
+          <w:sz w:val="15"/>
+        </w:rPr>
+        <w:t>ipn_test "$orderId" wrong-amount</w:t>
+      </w:r>
+    </w:p>
+    <w:p>
+      <w:pPr>
+        <w:spacing w:after="40"/>
+      </w:pPr>
+    </w:p>
+    <w:p>
+      <w:pPr>
+        <w:spacing w:after="100"/>
+      </w:pPr>
+      <w:r>
+        <w:rPr>
+          <w:b/>
+        </w:rPr>
+        <w:lastRenderedPageBreak/>
+        <w:t>KẾT QUẢ MONG ĐỢI:</w:t>
+      </w:r>
+      <w:r>
+        <w:rPr>
+          <w:color w:val="273E56"/>
+        </w:rPr>
+        <w:t xml:space="preserve"> IPN trả {"RspCode":"04","Message":"Invalid amount"}; khi xem đơn, status vẫn là "PENDING". Đây là IPN bị từ chối, KHÔNG phải giao dịch đã chuyển sang FAILED.</w:t>
+      </w:r>
+    </w:p>
+    <w:p>
+      <w:pPr>
+        <w:pStyle w:val="Heading2"/>
+        <w:spacing w:before="220" w:after="120"/>
+      </w:pPr>
+      <w:r>
+        <w:t>23  ·  Demo IPN sai chữ ký HMAC trên macOS</w:t>
+      </w:r>
+    </w:p>
+    <w:p>
+      <w:pPr>
+        <w:spacing w:after="100"/>
+      </w:pPr>
+      <w:r>
+        <w:t>Số tiền là 50.000 VNĐ nhưng chữ ký vnp_SecureHash bị cố tình thay bằng 128 ký tự 0, nên backend phải từ chối.</w:t>
+      </w:r>
+    </w:p>
+    <w:p>
+      <w:pPr>
+        <w:shd w:val="clear" w:color="auto" w:fill="F2F6FA"/>
+        <w:spacing w:after="0" w:line="240" w:lineRule="auto"/>
+        <w:ind w:left="245" w:right="115"/>
+      </w:pPr>
+      <w:r>
+        <w:rPr>
+          <w:rFonts w:ascii="Consolas" w:hAnsi="Consolas"/>
+          <w:color w:val="223D59"/>
+          <w:sz w:val="15"/>
+        </w:rPr>
+        <w:t>ipn_test "$orderId" wrong-signature</w:t>
+      </w:r>
+    </w:p>
+    <w:p>
+      <w:pPr>
+        <w:spacing w:after="40"/>
+      </w:pPr>
+    </w:p>
+    <w:p>
+      <w:pPr>
+        <w:spacing w:after="100"/>
+      </w:pPr>
+      <w:r>
+        <w:rPr>
+          <w:b/>
+        </w:rPr>
+        <w:t>KẾT QUẢ MONG ĐỢI:</w:t>
+      </w:r>
+      <w:r>
+        <w:rPr>
+          <w:color w:val="273E56"/>
+        </w:rPr>
+        <w:t xml:space="preserve"> IPN trả {"RspCode":"97","Message":"Invalid signature"}; đơn vẫn PENDING. Backend kiểm tra chữ ký trước khi xác nhận giao dịch.</w:t>
+      </w:r>
+    </w:p>
+    <w:p>
+      <w:pPr>
+        <w:spacing w:after="100"/>
+      </w:pPr>
     </w:p>
     <w:sectPr>
       <w:headerReference w:type="default" r:id="rId18"/>

</xml_diff>